<commit_message>
Troca o regulador PTN78020W pelo PTN78000WAH (Texas Instruments)
Atualiza BOM, datasheet, especificações (1,5A/91% em vez de 6A/96%,
módulo SIP de 5 pinos em vez de 7) e a nota do resistor de ajuste de
saída (Rset=21kΩ, confirmado via TI Analog Applications Journal +
fórum TI E2E, específico para o PTN78000W). A pinagem do novo módulo
(1=GND, 2=VI, 3=Inhibit, 4=VO, 5=VO Adjust) é diferente da do
PTN78020W anterior — sinalizada para confirmação física contra o
datasheet antes da montagem, já que não foi possível ler o PDF
completo neste ambiente (domínio bloqueado pelo proxy de rede).

Co-Authored-By: Claude Sonnet 5 <noreply@anthropic.com>
Claude-Session: https://claude.ai/code/session_01VvvtJDPvh4mDoSVpkHza1d
</commit_message>
<xml_diff>
--- a/docs/lista-de-materiais-hardware.docx
+++ b/docs/lista-de-materiais-hardware.docx
@@ -2046,7 +2046,7 @@
                 <w:sz w:val="20"/>
                 <w:szCs w:val="20"/>
               </w:rPr>
-              <w:t xml:space="preserve">Regulador de tensão comutado ajustável PTN78020W (Texas Instruments)</w:t>
+              <w:t>Regulador de tensão comutado ajustável PTN78000WAH (Texas Instruments)</w:t>
             </w:r>
           </w:p>
         </w:tc>
@@ -2760,7 +2760,7 @@
                 <w:sz w:val="20"/>
                 <w:szCs w:val="20"/>
               </w:rPr>
-              <w:t xml:space="preserve">6 — PTN78020W</w:t>
+              <w:t>6 — PTN78000WAH</w:t>
             </w:r>
           </w:p>
         </w:tc>
@@ -2788,7 +2788,7 @@
                 <w:sz w:val="20"/>
                 <w:szCs w:val="20"/>
               </w:rPr>
-              <w:t xml:space="preserve">Regulador comutado abaixador (step-down) integrado; tensão de entrada de 7 a 36 Vcc; tensão de saída ajustável de 2,5 a 12,6 V por meio de um único resistor externo; corrente de saída de até 6 A; rendimento de até 96 %; faixa de temperatura de operação de −40 °C a 85 °C.</w:t>
+              <w:t>Regulador comutado abaixador (step-down) integrado; tensão de entrada de 7 a 36 Vcc; tensão de saída ajustável de 2,5 a 12,6 V por meio de um único resistor externo; corrente de saída de até 1,5 A; rendimento de até 91 %; faixa de temperatura de operação de −40 °C a 85 °C; módulo SIP de 5 pinos, menor que o PTN78020W usado anteriormente (7 pinos).</w:t>
             </w:r>
           </w:p>
         </w:tc>
@@ -2816,7 +2816,7 @@
                 <w:sz w:val="20"/>
                 <w:szCs w:val="20"/>
               </w:rPr>
-              <w:t xml:space="preserve">PTN78020W Datasheet — Texas Instruments. Disponível em: https://www.ti.com/lit/ds/symlink/ptn78020w.pdf</w:t>
+              <w:t>PTN78000W Datasheet — Texas Instruments. Disponível em: https://www.ti.com/lit/ds/symlink/ptn78000w.pdf</w:t>
             </w:r>
           </w:p>
         </w:tc>
@@ -2874,7 +2874,7 @@
                 <w:sz w:val="20"/>
                 <w:szCs w:val="20"/>
               </w:rPr>
-              <w:t>Define a tensão de saída do item 6 em 5 V. Ligado entre os pinos 4 (VO Adjust) e 7 (GND); tolerância de 1 %, potência de 0,05 W e estabilidade térmica de 100 ppm/°C ou melhor; montado o mais próximo possível do regulador. Valor confirmado: 21 kΩ, conforme a Tabela 3 (circuitos de aplicação típica) do datasheet do item 6 (VI=15V, RSET=21kΩ -&gt; VO=5V, 88% de eficiência).</w:t>
+              <w:t>Define a tensão de saída do item 6 em 5 V. Ligado entre o pino 5 (VO Adjust) e o pino 1 (GND) — pinagem do módulo de 5 pinos (1=GND, 2=VI, 3=Inhibit, 4=VO, 5=VO Adjust), diferente da pinagem de 7 pinos do PTN78020W anterior; confirmar fisicamente contra o datasheet antes da montagem. Tolerância de 1 %, potência de 0,05 W e estabilidade térmica de 100 ppm/°C ou melhor; montado o mais próximo possível do regulador. Valor confirmado: 21 kΩ (TI Analog Applications Journal, tabela de valores padrão de Rset para o PTN78000W: RSET=21kΩ -&gt; VO≈4,996V≈5V; confirmado de forma independente no fórum TI E2E).</w:t>
             </w:r>
           </w:p>
         </w:tc>
@@ -3898,7 +3898,7 @@
                 <w:sz w:val="20"/>
                 <w:szCs w:val="20"/>
               </w:rPr>
-              <w:t xml:space="preserve">Grande parte da energia é dissipada como calor no regulador linear; alternativa ao PTN78020W, não utilizada em conjunto com ele</w:t>
+              <w:t>Grande parte da energia é dissipada como calor no regulador linear; alternativa ao PTN78000WAH, não utilizada em conjunto com ele</w:t>
             </w:r>
           </w:p>
         </w:tc>
@@ -3928,7 +3928,7 @@
                 <w:sz w:val="20"/>
                 <w:szCs w:val="20"/>
               </w:rPr>
-              <w:t xml:space="preserve">Pilha alcalina de 9 V com o regulador PTN78020W</w:t>
+              <w:t>Pilha alcalina de 9 V com o regulador PTN78000WAH</w:t>
             </w:r>
           </w:p>
         </w:tc>
@@ -4014,7 +4014,7 @@
                 <w:sz w:val="20"/>
                 <w:szCs w:val="20"/>
               </w:rPr>
-              <w:t xml:space="preserve">Quatro pilhas AA (6 V) com o regulador PTN78020W</w:t>
+              <w:t>Quatro pilhas AA (6 V) com o regulador PTN78000WAH</w:t>
             </w:r>
           </w:p>
         </w:tc>
@@ -4070,7 +4070,7 @@
                 <w:sz w:val="20"/>
                 <w:szCs w:val="20"/>
               </w:rPr>
-              <w:t xml:space="preserve">Maior capacidade total. ATENÇÃO: 6 V está próximo do limite inferior de entrada do PTN78020W (mínimo de 7 V); confirmar a tensão das pilhas ao longo da descarga antes de adotar esta combinação</w:t>
+              <w:t>Maior capacidade total. ATENÇÃO: 6 V está próximo do limite inferior de entrada do PTN78000WAH (mínimo de 7 V); confirmar a tensão das pilhas ao longo da descarga antes de adotar esta combinação</w:t>
             </w:r>
           </w:p>
         </w:tc>
@@ -4156,7 +4156,7 @@
                 <w:sz w:val="20"/>
                 <w:szCs w:val="20"/>
               </w:rPr>
-              <w:t xml:space="preserve">Recarregável. A tensão nominal (≈ 3,7 V) exige regulador elevador (boost), e não o PTN78020W, que apenas reduz tensão</w:t>
+              <w:t>Recarregável. A tensão nominal (≈ 3,7 V) exige regulador elevador (boost), e não o PTN78000WAH, que apenas reduz tensão</w:t>
             </w:r>
           </w:p>
         </w:tc>
@@ -4242,7 +4242,7 @@
                 <w:sz w:val="20"/>
                 <w:szCs w:val="20"/>
               </w:rPr>
-              <w:t xml:space="preserve">Já entrega 5 V regulados pela própria saída USB, dispensando o PTN78020W. Atentar ao corte automático em baixa corrente presente em alguns modelos</w:t>
+              <w:t>Já entrega 5 V regulados pela própria saída USB, dispensando o PTN78000WAH. Atentar ao corte automático em baixa corrente presente em alguns modelos</w:t>
             </w:r>
           </w:p>
         </w:tc>
@@ -4449,7 +4449,7 @@
           <w:sz w:val="24"/>
           <w:szCs w:val="24"/>
         </w:rPr>
-        <w:t xml:space="preserve">TEXAS INSTRUMENTS. PTN78020W: 6-A Wide-Input Voltage Adjustable Switching Regulator. Dallas, TX: Texas Instruments, 2008.</w:t>
+        <w:t>TEXAS INSTRUMENTS. PTN78000W: 1.5-A Wide-Input Adjustable Switching Regulator. Dallas, TX: Texas Instruments, 2008.</w:t>
       </w:r>
     </w:p>
     <w:sectPr>

</xml_diff>